<commit_message>
Learned services and imperative command, played with the default kubernetes service
</commit_message>
<xml_diff>
--- a/9-Interesting_learning_Notes/Learning_Notes.docx
+++ b/9-Interesting_learning_Notes/Learning_Notes.docx
@@ -283,6 +283,770 @@
       </w:r>
     </w:p>
     <w:p/>
+    <w:p>
+      <w:pPr>
+        <w:jc w:val="center"/>
+        <w:rPr>
+          <w:b/>
+          <w:bCs/>
+        </w:rPr>
+      </w:pPr>
+    </w:p>
+    <w:p>
+      <w:pPr>
+        <w:jc w:val="center"/>
+        <w:rPr>
+          <w:b/>
+          <w:bCs/>
+        </w:rPr>
+      </w:pPr>
+      <w:r>
+        <w:rPr>
+          <w:b/>
+          <w:bCs/>
+        </w:rPr>
+        <w:t>SERVICES</w:t>
+      </w:r>
+    </w:p>
+    <w:p/>
+    <w:p>
+      <w:r>
+        <w:rPr>
+          <w:b/>
+          <w:bCs/>
+        </w:rPr>
+        <w:t>Interesting Observation regarding Node port service</w:t>
+      </w:r>
+      <w:r>
+        <w:t xml:space="preserve">: </w:t>
+      </w:r>
+      <w:r>
+        <w:t xml:space="preserve">A Kubernetes </w:t>
+      </w:r>
+      <w:proofErr w:type="spellStart"/>
+      <w:r>
+        <w:t>NodePort</w:t>
+      </w:r>
+      <w:proofErr w:type="spellEnd"/>
+      <w:r>
+        <w:t xml:space="preserve"> does not create a normal listening socket on the node. Instead, </w:t>
+      </w:r>
+      <w:proofErr w:type="spellStart"/>
+      <w:r>
+        <w:t>Kuberne</w:t>
+      </w:r>
+      <w:r>
+        <w:t>s</w:t>
+      </w:r>
+      <w:r>
+        <w:t>tes</w:t>
+      </w:r>
+      <w:proofErr w:type="spellEnd"/>
+      <w:r>
+        <w:t xml:space="preserve"> configures networking rules to forward traffic arriving on that port to the Service. Therefore, if a host-level application is already listening on the same port, traffic arriving through that node may be handled by the existing application instead of reaching the Kubernetes Service, depending on the networking implementation and rule processing.</w:t>
+      </w:r>
+    </w:p>
+    <w:p/>
+    <w:p>
+      <w:proofErr w:type="spellStart"/>
+      <w:r>
+        <w:t>NodePort</w:t>
+      </w:r>
+      <w:proofErr w:type="spellEnd"/>
+      <w:r>
+        <w:t xml:space="preserve"> 30005 does NOT mean:</w:t>
+      </w:r>
+    </w:p>
+    <w:p>
+      <w:r>
+        <w:t>"A Kubernetes process must bind TCP port 30005."</w:t>
+      </w:r>
+    </w:p>
+    <w:p>
+      <w:r>
+        <w:lastRenderedPageBreak/>
+        <w:t>It means:</w:t>
+      </w:r>
+      <w:r>
+        <w:t xml:space="preserve"> </w:t>
+      </w:r>
+      <w:r>
+        <w:t>"Traffic arriving at the node for port 30005 should be handled by the Kubernetes Service."</w:t>
+      </w:r>
+    </w:p>
+    <w:p>
+      <w:r>
+        <w:t xml:space="preserve">packet gets </w:t>
+      </w:r>
+      <w:proofErr w:type="spellStart"/>
+      <w:r>
+        <w:rPr>
+          <w:b/>
+          <w:bCs/>
+        </w:rPr>
+        <w:t>DNAT'ed</w:t>
+      </w:r>
+      <w:proofErr w:type="spellEnd"/>
+      <w:r>
+        <w:rPr>
+          <w:b/>
+          <w:bCs/>
+        </w:rPr>
+        <w:t>/redirected by the Kubernetes networking rules before normal socket delivery</w:t>
+      </w:r>
+      <w:r>
+        <w:t>.</w:t>
+      </w:r>
+    </w:p>
+    <w:p/>
+    <w:p>
+      <w:pPr>
+        <w:rPr>
+          <w:b/>
+          <w:bCs/>
+        </w:rPr>
+      </w:pPr>
+      <w:r>
+        <w:t xml:space="preserve">The full DNS to refer a service is: </w:t>
+      </w:r>
+      <w:proofErr w:type="spellStart"/>
+      <w:proofErr w:type="gramStart"/>
+      <w:r>
+        <w:rPr>
+          <w:b/>
+          <w:bCs/>
+        </w:rPr>
+        <w:t>myservice.default.svc.cluster</w:t>
+      </w:r>
+      <w:proofErr w:type="gramEnd"/>
+      <w:r>
+        <w:rPr>
+          <w:b/>
+          <w:bCs/>
+        </w:rPr>
+        <w:t>.local</w:t>
+      </w:r>
+      <w:proofErr w:type="spellEnd"/>
+    </w:p>
+    <w:p>
+      <w:pPr>
+        <w:rPr>
+          <w:b/>
+          <w:bCs/>
+        </w:rPr>
+      </w:pPr>
+    </w:p>
+    <w:p>
+      <w:pPr>
+        <w:rPr>
+          <w:b/>
+          <w:bCs/>
+        </w:rPr>
+      </w:pPr>
+      <w:r>
+        <w:rPr>
+          <w:b/>
+          <w:bCs/>
+        </w:rPr>
+        <w:t>More interesting facts about the service structure and format</w:t>
+      </w:r>
+    </w:p>
+    <w:p>
+      <w:r>
+        <w:t xml:space="preserve">The Structure of a Kubernetes Service DNS </w:t>
+      </w:r>
+      <w:proofErr w:type="spellStart"/>
+      <w:r>
+        <w:t>NameEvery</w:t>
+      </w:r>
+      <w:proofErr w:type="spellEnd"/>
+      <w:r>
+        <w:t xml:space="preserve"> Service gets a full DNS address that looks like this:[service-name].[namespace].</w:t>
+      </w:r>
+      <w:proofErr w:type="spellStart"/>
+      <w:proofErr w:type="gramStart"/>
+      <w:r>
+        <w:t>svc.cluster</w:t>
+      </w:r>
+      <w:proofErr w:type="gramEnd"/>
+      <w:r>
+        <w:t>.local</w:t>
+      </w:r>
+      <w:proofErr w:type="spellEnd"/>
+    </w:p>
+    <w:p>
+      <w:pPr>
+        <w:pStyle w:val="ListParagraph"/>
+        <w:numPr>
+          <w:ilvl w:val="0"/>
+          <w:numId w:val="3"/>
+        </w:numPr>
+      </w:pPr>
+      <w:proofErr w:type="spellStart"/>
+      <w:r>
+        <w:t>service-</w:t>
+      </w:r>
+      <w:proofErr w:type="gramStart"/>
+      <w:r>
+        <w:t>name:The</w:t>
+      </w:r>
+      <w:proofErr w:type="spellEnd"/>
+      <w:proofErr w:type="gramEnd"/>
+      <w:r>
+        <w:t xml:space="preserve"> name you gave your Service.</w:t>
+      </w:r>
+    </w:p>
+    <w:p>
+      <w:pPr>
+        <w:pStyle w:val="ListParagraph"/>
+        <w:numPr>
+          <w:ilvl w:val="0"/>
+          <w:numId w:val="3"/>
+        </w:numPr>
+      </w:pPr>
+      <w:r>
+        <w:t>namespace: The namespace where the Service lives.</w:t>
+      </w:r>
+    </w:p>
+    <w:p>
+      <w:pPr>
+        <w:pStyle w:val="ListParagraph"/>
+        <w:numPr>
+          <w:ilvl w:val="0"/>
+          <w:numId w:val="3"/>
+        </w:numPr>
+      </w:pPr>
+      <w:r>
+        <w:t>svc: Short for service (tells Kubernetes this is a Service, not a Pod).</w:t>
+      </w:r>
+    </w:p>
+    <w:p>
+      <w:proofErr w:type="spellStart"/>
+      <w:proofErr w:type="gramStart"/>
+      <w:r>
+        <w:t>cluster.local</w:t>
+      </w:r>
+      <w:proofErr w:type="spellEnd"/>
+      <w:proofErr w:type="gramEnd"/>
+      <w:r>
+        <w:t>: The default local domain name for your entire cluster.</w:t>
+      </w:r>
+    </w:p>
+    <w:p/>
+    <w:p>
+      <w:r>
+        <w:t xml:space="preserve">Scenario </w:t>
+      </w:r>
+      <w:proofErr w:type="gramStart"/>
+      <w:r>
+        <w:t>A</w:t>
+      </w:r>
+      <w:proofErr w:type="gramEnd"/>
+      <w:r>
+        <w:t xml:space="preserve"> Example: A pod in the "frontend" namespace connects to a database in the same namespace using just "</w:t>
+      </w:r>
+      <w:proofErr w:type="spellStart"/>
+      <w:r>
+        <w:t>db</w:t>
+      </w:r>
+      <w:proofErr w:type="spellEnd"/>
+      <w:r>
+        <w:t>-service".</w:t>
+      </w:r>
+    </w:p>
+    <w:p>
+      <w:r>
+        <w:t>Scenario B Example: A pod in the "frontend" namespace connects to a database in the "backend" namespace using "</w:t>
+      </w:r>
+      <w:proofErr w:type="spellStart"/>
+      <w:r>
+        <w:t>db-</w:t>
+      </w:r>
+      <w:proofErr w:type="gramStart"/>
+      <w:r>
+        <w:t>service.backend</w:t>
+      </w:r>
+      <w:proofErr w:type="spellEnd"/>
+      <w:proofErr w:type="gramEnd"/>
+      <w:r>
+        <w:t>".</w:t>
+      </w:r>
+    </w:p>
+    <w:p>
+      <w:r>
+        <w:t>The remaining part of the address—.</w:t>
+      </w:r>
+      <w:proofErr w:type="spellStart"/>
+      <w:proofErr w:type="gramStart"/>
+      <w:r>
+        <w:t>svc.cluster</w:t>
+      </w:r>
+      <w:proofErr w:type="gramEnd"/>
+      <w:r>
+        <w:t>.local</w:t>
+      </w:r>
+      <w:proofErr w:type="spellEnd"/>
+      <w:r>
+        <w:t>—is called the cluster suffix. It is not mandatory because every container running inside a Kubernetes Pod has a hidden configuration file (/</w:t>
+      </w:r>
+      <w:proofErr w:type="spellStart"/>
+      <w:r>
+        <w:t>etc</w:t>
+      </w:r>
+      <w:proofErr w:type="spellEnd"/>
+      <w:r>
+        <w:t>/</w:t>
+      </w:r>
+      <w:proofErr w:type="spellStart"/>
+      <w:r>
+        <w:t>resolv.conf</w:t>
+      </w:r>
+      <w:proofErr w:type="spellEnd"/>
+      <w:r>
+        <w:t xml:space="preserve">) created automatically by the cluster. it </w:t>
+      </w:r>
+      <w:proofErr w:type="gramStart"/>
+      <w:r>
+        <w:t>contain</w:t>
+      </w:r>
+      <w:proofErr w:type="gramEnd"/>
+      <w:r>
+        <w:t xml:space="preserve"> all the search </w:t>
+      </w:r>
+      <w:proofErr w:type="spellStart"/>
+      <w:proofErr w:type="gramStart"/>
+      <w:r>
+        <w:t>list.Because</w:t>
+      </w:r>
+      <w:proofErr w:type="spellEnd"/>
+      <w:proofErr w:type="gramEnd"/>
+      <w:r>
+        <w:t xml:space="preserve"> of this search list, if you type just </w:t>
+      </w:r>
+      <w:proofErr w:type="spellStart"/>
+      <w:r>
+        <w:t>db</w:t>
+      </w:r>
+      <w:proofErr w:type="spellEnd"/>
+      <w:r>
+        <w:t>-service, Kubernetes automatically appends the remaining parts (.</w:t>
+      </w:r>
+      <w:proofErr w:type="spellStart"/>
+      <w:proofErr w:type="gramStart"/>
+      <w:r>
+        <w:t>svc.cluster</w:t>
+      </w:r>
+      <w:proofErr w:type="gramEnd"/>
+      <w:r>
+        <w:t>.local</w:t>
+      </w:r>
+      <w:proofErr w:type="spellEnd"/>
+      <w:r>
+        <w:t>) behind the scenes and tests them one by one until it finds a match!</w:t>
+      </w:r>
+    </w:p>
+    <w:p>
+      <w:pPr>
+        <w:rPr>
+          <w:b/>
+          <w:bCs/>
+        </w:rPr>
+      </w:pPr>
+      <w:r>
+        <w:rPr>
+          <w:b/>
+          <w:bCs/>
+        </w:rPr>
+        <w:drawing>
+          <wp:inline distT="0" distB="0" distL="0" distR="0" wp14:anchorId="13853823" wp14:editId="78C750C8">
+            <wp:extent cx="5420481" cy="1066949"/>
+            <wp:effectExtent l="0" t="0" r="0" b="0"/>
+            <wp:docPr id="1871590098" name="Picture 1"/>
+            <wp:cNvGraphicFramePr>
+              <a:graphicFrameLocks xmlns:a="http://schemas.openxmlformats.org/drawingml/2006/main" noChangeAspect="1"/>
+            </wp:cNvGraphicFramePr>
+            <a:graphic xmlns:a="http://schemas.openxmlformats.org/drawingml/2006/main">
+              <a:graphicData uri="http://schemas.openxmlformats.org/drawingml/2006/picture">
+                <pic:pic xmlns:pic="http://schemas.openxmlformats.org/drawingml/2006/picture">
+                  <pic:nvPicPr>
+                    <pic:cNvPr id="1871590098" name=""/>
+                    <pic:cNvPicPr/>
+                  </pic:nvPicPr>
+                  <pic:blipFill>
+                    <a:blip r:embed="rId5"/>
+                    <a:stretch>
+                      <a:fillRect/>
+                    </a:stretch>
+                  </pic:blipFill>
+                  <pic:spPr>
+                    <a:xfrm>
+                      <a:off x="0" y="0"/>
+                      <a:ext cx="5420481" cy="1066949"/>
+                    </a:xfrm>
+                    <a:prstGeom prst="rect">
+                      <a:avLst/>
+                    </a:prstGeom>
+                  </pic:spPr>
+                </pic:pic>
+              </a:graphicData>
+            </a:graphic>
+          </wp:inline>
+        </w:drawing>
+      </w:r>
+    </w:p>
+    <w:p>
+      <w:pPr>
+        <w:jc w:val="center"/>
+        <w:rPr>
+          <w:b/>
+          <w:bCs/>
+        </w:rPr>
+      </w:pPr>
+    </w:p>
+    <w:p>
+      <w:r>
+        <w:lastRenderedPageBreak/>
+        <w:t>To add a pod to a service manually:</w:t>
+      </w:r>
+    </w:p>
+    <w:p>
+      <w:r>
+        <w:t>Create the service.</w:t>
+      </w:r>
+    </w:p>
+    <w:p>
+      <w:r>
+        <w:t xml:space="preserve">Edit the </w:t>
+      </w:r>
+      <w:r>
+        <w:t>service:</w:t>
+      </w:r>
+      <w:r>
+        <w:t xml:space="preserve"> </w:t>
+      </w:r>
+      <w:proofErr w:type="spellStart"/>
+      <w:r>
+        <w:t>kubectl</w:t>
+      </w:r>
+      <w:proofErr w:type="spellEnd"/>
+      <w:r>
+        <w:t xml:space="preserve"> </w:t>
+      </w:r>
+      <w:r>
+        <w:rPr>
+          <w:b/>
+          <w:bCs/>
+        </w:rPr>
+        <w:t>edit</w:t>
+      </w:r>
+      <w:r>
+        <w:t xml:space="preserve"> svc my-</w:t>
+      </w:r>
+      <w:proofErr w:type="spellStart"/>
+      <w:r>
+        <w:t>nodeport</w:t>
+      </w:r>
+      <w:proofErr w:type="spellEnd"/>
+      <w:r>
+        <w:t>-service</w:t>
+      </w:r>
+    </w:p>
+    <w:p>
+      <w:r>
+        <w:t xml:space="preserve">Under the selector section, add the label of the pod. The pod label can be found </w:t>
+      </w:r>
+      <w:proofErr w:type="gramStart"/>
+      <w:r>
+        <w:t>using :</w:t>
+      </w:r>
+      <w:proofErr w:type="gramEnd"/>
+      <w:r>
+        <w:t xml:space="preserve"> </w:t>
+      </w:r>
+      <w:proofErr w:type="spellStart"/>
+      <w:r>
+        <w:t>k</w:t>
+      </w:r>
+      <w:r>
+        <w:t>ubectl</w:t>
+      </w:r>
+      <w:proofErr w:type="spellEnd"/>
+      <w:r>
+        <w:t xml:space="preserve"> </w:t>
+      </w:r>
+      <w:r>
+        <w:t xml:space="preserve">get pods </w:t>
+      </w:r>
+      <w:r>
+        <w:rPr>
+          <w:b/>
+          <w:bCs/>
+        </w:rPr>
+        <w:t>--show-labels</w:t>
+      </w:r>
+    </w:p>
+    <w:p/>
+    <w:p>
+      <w:pPr>
+        <w:jc w:val="center"/>
+        <w:rPr>
+          <w:b/>
+          <w:bCs/>
+        </w:rPr>
+      </w:pPr>
+    </w:p>
+    <w:p>
+      <w:pPr>
+        <w:jc w:val="center"/>
+        <w:rPr>
+          <w:b/>
+          <w:bCs/>
+        </w:rPr>
+      </w:pPr>
+    </w:p>
+    <w:p>
+      <w:pPr>
+        <w:jc w:val="center"/>
+        <w:rPr>
+          <w:b/>
+          <w:bCs/>
+        </w:rPr>
+      </w:pPr>
+      <w:r>
+        <w:rPr>
+          <w:b/>
+          <w:bCs/>
+        </w:rPr>
+        <w:t>GENERAL KUBERNETES KNOWLEDGE</w:t>
+      </w:r>
+    </w:p>
+    <w:p>
+      <w:pPr>
+        <w:rPr>
+          <w:b/>
+          <w:bCs/>
+        </w:rPr>
+      </w:pPr>
+    </w:p>
+    <w:p>
+      <w:proofErr w:type="spellStart"/>
+      <w:r>
+        <w:t>kubectl</w:t>
+      </w:r>
+      <w:proofErr w:type="spellEnd"/>
+      <w:r>
+        <w:t xml:space="preserve"> </w:t>
+      </w:r>
+      <w:proofErr w:type="spellStart"/>
+      <w:r>
+        <w:t>api</w:t>
+      </w:r>
+      <w:proofErr w:type="spellEnd"/>
+      <w:r>
+        <w:t xml:space="preserve">-resources -o </w:t>
+      </w:r>
+      <w:proofErr w:type="gramStart"/>
+      <w:r>
+        <w:t>wide</w:t>
+      </w:r>
+      <w:r>
+        <w:t xml:space="preserve"> :</w:t>
+      </w:r>
+      <w:proofErr w:type="gramEnd"/>
+      <w:r>
+        <w:t xml:space="preserve"> shows all resources of Kubernetes. Helps to find the </w:t>
+      </w:r>
+      <w:proofErr w:type="spellStart"/>
+      <w:r>
+        <w:t>apiversion</w:t>
+      </w:r>
+      <w:proofErr w:type="spellEnd"/>
+      <w:r>
+        <w:t xml:space="preserve">.  </w:t>
+      </w:r>
+    </w:p>
+    <w:p>
+      <w:r>
+        <w:t xml:space="preserve">When you run </w:t>
+      </w:r>
+      <w:proofErr w:type="spellStart"/>
+      <w:r>
+        <w:t>kubectl</w:t>
+      </w:r>
+      <w:proofErr w:type="spellEnd"/>
+      <w:r>
+        <w:t xml:space="preserve"> get all, the resources that should be included in the “</w:t>
+      </w:r>
+      <w:r>
+        <w:rPr>
+          <w:b/>
+          <w:bCs/>
+        </w:rPr>
+        <w:t>all</w:t>
+      </w:r>
+      <w:r>
+        <w:t>” can be seen in the output of “</w:t>
+      </w:r>
+      <w:proofErr w:type="spellStart"/>
+      <w:r>
+        <w:t>kubectl</w:t>
+      </w:r>
+      <w:proofErr w:type="spellEnd"/>
+      <w:r>
+        <w:t xml:space="preserve"> </w:t>
+      </w:r>
+      <w:proofErr w:type="spellStart"/>
+      <w:r>
+        <w:t>api</w:t>
+      </w:r>
+      <w:proofErr w:type="spellEnd"/>
+      <w:r>
+        <w:t>-resources -o wide</w:t>
+      </w:r>
+      <w:r>
+        <w:t xml:space="preserve">” command, under the </w:t>
+      </w:r>
+      <w:r>
+        <w:rPr>
+          <w:b/>
+          <w:bCs/>
+        </w:rPr>
+        <w:t>CATEGORIES</w:t>
+      </w:r>
+      <w:r>
+        <w:t xml:space="preserve"> </w:t>
+      </w:r>
+      <w:r>
+        <w:t>columns</w:t>
+      </w:r>
+    </w:p>
+    <w:p/>
+    <w:p>
+      <w:r>
+        <w:t xml:space="preserve">The cluster-info CA certificate in </w:t>
+      </w:r>
+      <w:proofErr w:type="spellStart"/>
+      <w:r>
+        <w:t>kube</w:t>
+      </w:r>
+      <w:proofErr w:type="spellEnd"/>
+      <w:r>
+        <w:t>-public acts just like the trusted root certificates in your web browser, allowing new clients to safely verify the identity of the Kubernetes API server during a secure TLS connection.</w:t>
+      </w:r>
+    </w:p>
+    <w:p/>
+    <w:p/>
+    <w:p>
+      <w:pPr>
+        <w:jc w:val="center"/>
+        <w:rPr>
+          <w:b/>
+          <w:bCs/>
+        </w:rPr>
+      </w:pPr>
+      <w:r>
+        <w:rPr>
+          <w:b/>
+          <w:bCs/>
+        </w:rPr>
+        <w:t>KUBECTL COMMANDS RELATED</w:t>
+      </w:r>
+    </w:p>
+    <w:p/>
+    <w:p>
+      <w:r>
+        <w:t xml:space="preserve">To delete all pods together: </w:t>
+      </w:r>
+      <w:proofErr w:type="spellStart"/>
+      <w:r>
+        <w:t>k</w:t>
+      </w:r>
+      <w:r>
+        <w:t>ubectl</w:t>
+      </w:r>
+      <w:proofErr w:type="spellEnd"/>
+      <w:r>
+        <w:t xml:space="preserve"> </w:t>
+      </w:r>
+      <w:r>
+        <w:t>delete</w:t>
+      </w:r>
+      <w:r>
+        <w:t xml:space="preserve"> </w:t>
+      </w:r>
+      <w:r>
+        <w:t>po</w:t>
+      </w:r>
+      <w:r>
+        <w:t>ds –</w:t>
+      </w:r>
+      <w:r>
+        <w:t>all</w:t>
+      </w:r>
+    </w:p>
+    <w:p>
+      <w:r>
+        <w:t xml:space="preserve">For namespace specific </w:t>
+      </w:r>
+      <w:r>
+        <w:t>resources</w:t>
+      </w:r>
+      <w:r>
+        <w:t xml:space="preserve">: </w:t>
+      </w:r>
+      <w:proofErr w:type="spellStart"/>
+      <w:r>
+        <w:t>kubectl</w:t>
+      </w:r>
+      <w:proofErr w:type="spellEnd"/>
+      <w:r>
+        <w:t xml:space="preserve"> delete pods --all -n &lt;namespace-name&gt;</w:t>
+      </w:r>
+    </w:p>
+    <w:p/>
+    <w:p>
+      <w:r>
+        <w:t xml:space="preserve">k </w:t>
+      </w:r>
+      <w:proofErr w:type="gramStart"/>
+      <w:r>
+        <w:t>get</w:t>
+      </w:r>
+      <w:proofErr w:type="gramEnd"/>
+      <w:r>
+        <w:t xml:space="preserve"> pods </w:t>
+      </w:r>
+      <w:r>
+        <w:rPr>
+          <w:b/>
+          <w:bCs/>
+        </w:rPr>
+        <w:t>--show-</w:t>
+      </w:r>
+      <w:proofErr w:type="gramStart"/>
+      <w:r>
+        <w:rPr>
+          <w:b/>
+          <w:bCs/>
+        </w:rPr>
+        <w:t>labels</w:t>
+      </w:r>
+      <w:r>
+        <w:t xml:space="preserve"> :</w:t>
+      </w:r>
+      <w:proofErr w:type="gramEnd"/>
+      <w:r>
+        <w:t xml:space="preserve">  This helps to see the labels attached to a resource. Useful to se</w:t>
+      </w:r>
+      <w:r>
+        <w:t xml:space="preserve">e </w:t>
+      </w:r>
+      <w:proofErr w:type="spellStart"/>
+      <w:r>
+        <w:t>labels.</w:t>
+      </w:r>
+      <w:proofErr w:type="spellEnd"/>
+    </w:p>
     <w:sectPr>
       <w:pgSz w:w="12240" w:h="15840"/>
       <w:pgMar w:top="1440" w:right="1440" w:bottom="1440" w:left="1440" w:header="708" w:footer="708" w:gutter="0"/>
@@ -296,6 +1060,119 @@
 <file path=word/numbering.xml><?xml version="1.0" encoding="utf-8"?>
 <w:numbering xmlns:wpc="http://schemas.microsoft.com/office/word/2010/wordprocessingCanvas" xmlns:cx="http://schemas.microsoft.com/office/drawing/2014/chartex" xmlns:cx1="http://schemas.microsoft.com/office/drawing/2015/9/8/chartex" xmlns:cx2="http://schemas.microsoft.com/office/drawing/2015/10/21/chartex" xmlns:cx3="http://schemas.microsoft.com/office/drawing/2016/5/9/chartex" xmlns:cx4="http://schemas.microsoft.com/office/drawing/2016/5/10/chartex" xmlns:cx5="http://schemas.microsoft.com/office/drawing/2016/5/11/chartex" xmlns:cx6="http://schemas.microsoft.com/office/drawing/2016/5/12/chartex" xmlns:cx7="http://schemas.microsoft.com/office/drawing/2016/5/13/chartex" xmlns:cx8="http://schemas.microsoft.com/office/drawing/2016/5/14/chartex" xmlns:mc="http://schemas.openxmlformats.org/markup-compatibility/2006" xmlns:aink="http://schemas.microsoft.com/office/drawing/2016/ink" xmlns:am3d="http://schemas.microsoft.com/office/drawing/2017/model3d" xmlns:o="urn:schemas-microsoft-com:office:office" xmlns:oel="http://schemas.microsoft.com/office/2019/extlst" xmlns:r="http://schemas.openxmlformats.org/officeDocument/2006/relationships" xmlns:m="http://schemas.openxmlformats.org/officeDocument/2006/math" xmlns:v="urn:schemas-microsoft-com:vml" xmlns:wp14="http://schemas.microsoft.com/office/word/2010/wordprocessingDrawing" xmlns:wp="http://schemas.openxmlformats.org/drawingml/2006/wordprocessingDrawing" xmlns:w10="urn:schemas-microsoft-com:office:word" xmlns:w="http://schemas.openxmlformats.org/wordprocessingml/2006/main" xmlns:w14="http://schemas.microsoft.com/office/word/2010/wordml" xmlns:w15="http://schemas.microsoft.com/office/word/2012/wordml" xmlns:w16cex="http://schemas.microsoft.com/office/word/2018/wordml/cex" xmlns:w16cid="http://schemas.microsoft.com/office/word/2016/wordml/cid" xmlns:w16="http://schemas.microsoft.com/office/word/2018/wordml" xmlns:w16du="http://schemas.microsoft.com/office/word/2023/wordml/word16du" xmlns:w16sdtdh="http://schemas.microsoft.com/office/word/2020/wordml/sdtdatahash" xmlns:w16sdtfl="http://schemas.microsoft.com/office/word/2024/wordml/sdtformatlock" xmlns:w16se="http://schemas.microsoft.com/office/word/2015/wordml/symex" xmlns:wpg="http://schemas.microsoft.com/office/word/2010/wordprocessingGroup" xmlns:wpi="http://schemas.microsoft.com/office/word/2010/wordprocessingInk" xmlns:wne="http://schemas.microsoft.com/office/word/2006/wordml" xmlns:wps="http://schemas.microsoft.com/office/word/2010/wordprocessingShape" mc:Ignorable="w14 w15 w16se w16cid w16 w16cex w16sdtdh w16sdtfl w16du wp14">
   <w:abstractNum w:abstractNumId="0" w15:restartNumberingAfterBreak="0">
+    <w:nsid w:val="21A273DA"/>
+    <w:multiLevelType w:val="hybridMultilevel"/>
+    <w:tmpl w:val="825437A6"/>
+    <w:lvl w:ilvl="0" w:tplc="10090001">
+      <w:start w:val="1"/>
+      <w:numFmt w:val="bullet"/>
+      <w:lvlText w:val=""/>
+      <w:lvlJc w:val="left"/>
+      <w:pPr>
+        <w:ind w:left="720" w:hanging="360"/>
+      </w:pPr>
+      <w:rPr>
+        <w:rFonts w:ascii="Symbol" w:hAnsi="Symbol" w:hint="default"/>
+      </w:rPr>
+    </w:lvl>
+    <w:lvl w:ilvl="1" w:tplc="10090003" w:tentative="1">
+      <w:start w:val="1"/>
+      <w:numFmt w:val="bullet"/>
+      <w:lvlText w:val="o"/>
+      <w:lvlJc w:val="left"/>
+      <w:pPr>
+        <w:ind w:left="1440" w:hanging="360"/>
+      </w:pPr>
+      <w:rPr>
+        <w:rFonts w:ascii="Courier New" w:hAnsi="Courier New" w:cs="Courier New" w:hint="default"/>
+      </w:rPr>
+    </w:lvl>
+    <w:lvl w:ilvl="2" w:tplc="10090005" w:tentative="1">
+      <w:start w:val="1"/>
+      <w:numFmt w:val="bullet"/>
+      <w:lvlText w:val=""/>
+      <w:lvlJc w:val="left"/>
+      <w:pPr>
+        <w:ind w:left="2160" w:hanging="360"/>
+      </w:pPr>
+      <w:rPr>
+        <w:rFonts w:ascii="Wingdings" w:hAnsi="Wingdings" w:hint="default"/>
+      </w:rPr>
+    </w:lvl>
+    <w:lvl w:ilvl="3" w:tplc="10090001" w:tentative="1">
+      <w:start w:val="1"/>
+      <w:numFmt w:val="bullet"/>
+      <w:lvlText w:val=""/>
+      <w:lvlJc w:val="left"/>
+      <w:pPr>
+        <w:ind w:left="2880" w:hanging="360"/>
+      </w:pPr>
+      <w:rPr>
+        <w:rFonts w:ascii="Symbol" w:hAnsi="Symbol" w:hint="default"/>
+      </w:rPr>
+    </w:lvl>
+    <w:lvl w:ilvl="4" w:tplc="10090003" w:tentative="1">
+      <w:start w:val="1"/>
+      <w:numFmt w:val="bullet"/>
+      <w:lvlText w:val="o"/>
+      <w:lvlJc w:val="left"/>
+      <w:pPr>
+        <w:ind w:left="3600" w:hanging="360"/>
+      </w:pPr>
+      <w:rPr>
+        <w:rFonts w:ascii="Courier New" w:hAnsi="Courier New" w:cs="Courier New" w:hint="default"/>
+      </w:rPr>
+    </w:lvl>
+    <w:lvl w:ilvl="5" w:tplc="10090005" w:tentative="1">
+      <w:start w:val="1"/>
+      <w:numFmt w:val="bullet"/>
+      <w:lvlText w:val=""/>
+      <w:lvlJc w:val="left"/>
+      <w:pPr>
+        <w:ind w:left="4320" w:hanging="360"/>
+      </w:pPr>
+      <w:rPr>
+        <w:rFonts w:ascii="Wingdings" w:hAnsi="Wingdings" w:hint="default"/>
+      </w:rPr>
+    </w:lvl>
+    <w:lvl w:ilvl="6" w:tplc="10090001" w:tentative="1">
+      <w:start w:val="1"/>
+      <w:numFmt w:val="bullet"/>
+      <w:lvlText w:val=""/>
+      <w:lvlJc w:val="left"/>
+      <w:pPr>
+        <w:ind w:left="5040" w:hanging="360"/>
+      </w:pPr>
+      <w:rPr>
+        <w:rFonts w:ascii="Symbol" w:hAnsi="Symbol" w:hint="default"/>
+      </w:rPr>
+    </w:lvl>
+    <w:lvl w:ilvl="7" w:tplc="10090003" w:tentative="1">
+      <w:start w:val="1"/>
+      <w:numFmt w:val="bullet"/>
+      <w:lvlText w:val="o"/>
+      <w:lvlJc w:val="left"/>
+      <w:pPr>
+        <w:ind w:left="5760" w:hanging="360"/>
+      </w:pPr>
+      <w:rPr>
+        <w:rFonts w:ascii="Courier New" w:hAnsi="Courier New" w:cs="Courier New" w:hint="default"/>
+      </w:rPr>
+    </w:lvl>
+    <w:lvl w:ilvl="8" w:tplc="10090005" w:tentative="1">
+      <w:start w:val="1"/>
+      <w:numFmt w:val="bullet"/>
+      <w:lvlText w:val=""/>
+      <w:lvlJc w:val="left"/>
+      <w:pPr>
+        <w:ind w:left="6480" w:hanging="360"/>
+      </w:pPr>
+      <w:rPr>
+        <w:rFonts w:ascii="Wingdings" w:hAnsi="Wingdings" w:hint="default"/>
+      </w:rPr>
+    </w:lvl>
+  </w:abstractNum>
+  <w:abstractNum w:abstractNumId="1" w15:restartNumberingAfterBreak="0">
     <w:nsid w:val="6F6B297F"/>
     <w:multiLevelType w:val="hybridMultilevel"/>
     <w:tmpl w:val="90604326"/>
@@ -407,7 +1284,7 @@
       </w:rPr>
     </w:lvl>
   </w:abstractNum>
-  <w:abstractNum w:abstractNumId="1" w15:restartNumberingAfterBreak="0">
+  <w:abstractNum w:abstractNumId="2" w15:restartNumberingAfterBreak="0">
     <w:nsid w:val="7FE96A27"/>
     <w:multiLevelType w:val="multilevel"/>
     <w:tmpl w:val="2E109BCA"/>
@@ -557,10 +1434,13 @@
     </w:lvl>
   </w:abstractNum>
   <w:num w:numId="1" w16cid:durableId="1329406315">
-    <w:abstractNumId w:val="0"/>
+    <w:abstractNumId w:val="1"/>
   </w:num>
   <w:num w:numId="2" w16cid:durableId="346176687">
-    <w:abstractNumId w:val="1"/>
+    <w:abstractNumId w:val="2"/>
+  </w:num>
+  <w:num w:numId="3" w16cid:durableId="588125869">
+    <w:abstractNumId w:val="0"/>
   </w:num>
 </w:numbering>
 </file>
@@ -1168,7 +2048,6 @@
   <w:style w:type="character" w:default="1" w:styleId="DefaultParagraphFont">
     <w:name w:val="Default Paragraph Font"/>
     <w:uiPriority w:val="1"/>
-    <w:semiHidden/>
     <w:unhideWhenUsed/>
   </w:style>
   <w:style w:type="table" w:default="1" w:styleId="TableNormal">

</xml_diff>

<commit_message>
Learned more about imperative commands and services
</commit_message>
<xml_diff>
--- a/9-Interesting_learning_Notes/Learning_Notes.docx
+++ b/9-Interesting_learning_Notes/Learning_Notes.docx
@@ -410,21 +410,12 @@
         <w:t xml:space="preserve">The full DNS to refer a service is: </w:t>
       </w:r>
       <w:proofErr w:type="spellStart"/>
-      <w:proofErr w:type="gramStart"/>
-      <w:r>
-        <w:rPr>
-          <w:b/>
-          <w:bCs/>
-        </w:rPr>
-        <w:t>myservice.default.svc.cluster</w:t>
-      </w:r>
-      <w:proofErr w:type="gramEnd"/>
-      <w:r>
-        <w:rPr>
-          <w:b/>
-          <w:bCs/>
-        </w:rPr>
-        <w:t>.local</w:t>
+      <w:r>
+        <w:rPr>
+          <w:b/>
+          <w:bCs/>
+        </w:rPr>
+        <w:t>myservice.default.svc.cluster.local</w:t>
       </w:r>
       <w:proofErr w:type="spellEnd"/>
     </w:p>
@@ -464,13 +455,8 @@
         <w:t xml:space="preserve"> Service gets a full DNS address that looks like this:[service-name].[namespace].</w:t>
       </w:r>
       <w:proofErr w:type="spellStart"/>
-      <w:proofErr w:type="gramStart"/>
-      <w:r>
-        <w:t>svc.cluster</w:t>
-      </w:r>
-      <w:proofErr w:type="gramEnd"/>
-      <w:r>
-        <w:t>.local</w:t>
+      <w:r>
+        <w:t>svc.cluster.local</w:t>
       </w:r>
       <w:proofErr w:type="spellEnd"/>
     </w:p>
@@ -484,14 +470,9 @@
       </w:pPr>
       <w:proofErr w:type="spellStart"/>
       <w:r>
-        <w:t>service-</w:t>
-      </w:r>
-      <w:proofErr w:type="gramStart"/>
-      <w:r>
-        <w:t>name:The</w:t>
-      </w:r>
-      <w:proofErr w:type="spellEnd"/>
-      <w:proofErr w:type="gramEnd"/>
+        <w:t>service-name:The</w:t>
+      </w:r>
+      <w:proofErr w:type="spellEnd"/>
       <w:r>
         <w:t xml:space="preserve"> name you gave your Service.</w:t>
       </w:r>
@@ -522,12 +503,10 @@
     </w:p>
     <w:p>
       <w:proofErr w:type="spellStart"/>
-      <w:proofErr w:type="gramStart"/>
       <w:r>
         <w:t>cluster.local</w:t>
       </w:r>
       <w:proofErr w:type="spellEnd"/>
-      <w:proofErr w:type="gramEnd"/>
       <w:r>
         <w:t>: The default local domain name for your entire cluster.</w:t>
       </w:r>
@@ -535,15 +514,7 @@
     <w:p/>
     <w:p>
       <w:r>
-        <w:t xml:space="preserve">Scenario </w:t>
-      </w:r>
-      <w:proofErr w:type="gramStart"/>
-      <w:r>
-        <w:t>A</w:t>
-      </w:r>
-      <w:proofErr w:type="gramEnd"/>
-      <w:r>
-        <w:t xml:space="preserve"> Example: A pod in the "frontend" namespace connects to a database in the same namespace using just "</w:t>
+        <w:t>Scenario A Example: A pod in the "frontend" namespace connects to a database in the same namespace using just "</w:t>
       </w:r>
       <w:proofErr w:type="spellStart"/>
       <w:r>
@@ -560,14 +531,9 @@
       </w:r>
       <w:proofErr w:type="spellStart"/>
       <w:r>
-        <w:t>db-</w:t>
-      </w:r>
-      <w:proofErr w:type="gramStart"/>
-      <w:r>
-        <w:t>service.backend</w:t>
-      </w:r>
-      <w:proofErr w:type="spellEnd"/>
-      <w:proofErr w:type="gramEnd"/>
+        <w:t>db-service.backend</w:t>
+      </w:r>
+      <w:proofErr w:type="spellEnd"/>
       <w:r>
         <w:t>".</w:t>
       </w:r>
@@ -577,13 +543,8 @@
         <w:t>The remaining part of the address—.</w:t>
       </w:r>
       <w:proofErr w:type="spellStart"/>
-      <w:proofErr w:type="gramStart"/>
-      <w:r>
-        <w:t>svc.cluster</w:t>
-      </w:r>
-      <w:proofErr w:type="gramEnd"/>
-      <w:r>
-        <w:t>.local</w:t>
+      <w:r>
+        <w:t>svc.cluster.local</w:t>
       </w:r>
       <w:proofErr w:type="spellEnd"/>
       <w:r>
@@ -603,23 +564,13 @@
       </w:r>
       <w:proofErr w:type="spellEnd"/>
       <w:r>
-        <w:t xml:space="preserve">) created automatically by the cluster. it </w:t>
-      </w:r>
-      <w:proofErr w:type="gramStart"/>
-      <w:r>
-        <w:t>contain</w:t>
-      </w:r>
-      <w:proofErr w:type="gramEnd"/>
-      <w:r>
-        <w:t xml:space="preserve"> all the search </w:t>
-      </w:r>
-      <w:proofErr w:type="spellStart"/>
-      <w:proofErr w:type="gramStart"/>
+        <w:t xml:space="preserve">) created automatically by the cluster. it contain all the search </w:t>
+      </w:r>
+      <w:proofErr w:type="spellStart"/>
       <w:r>
         <w:t>list.Because</w:t>
       </w:r>
       <w:proofErr w:type="spellEnd"/>
-      <w:proofErr w:type="gramEnd"/>
       <w:r>
         <w:t xml:space="preserve"> of this search list, if you type just </w:t>
       </w:r>
@@ -632,13 +583,8 @@
         <w:t>-service, Kubernetes automatically appends the remaining parts (.</w:t>
       </w:r>
       <w:proofErr w:type="spellStart"/>
-      <w:proofErr w:type="gramStart"/>
-      <w:r>
-        <w:t>svc.cluster</w:t>
-      </w:r>
-      <w:proofErr w:type="gramEnd"/>
-      <w:r>
-        <w:t>.local</w:t>
+      <w:r>
+        <w:t>svc.cluster.local</w:t>
       </w:r>
       <w:proofErr w:type="spellEnd"/>
       <w:r>
@@ -656,6 +602,7 @@
         <w:rPr>
           <w:b/>
           <w:bCs/>
+          <w:noProof/>
         </w:rPr>
         <w:drawing>
           <wp:inline distT="0" distB="0" distL="0" distR="0" wp14:anchorId="13853823" wp14:editId="78C750C8">
@@ -755,11 +702,9 @@
       <w:r>
         <w:t xml:space="preserve">Under the selector section, add the label of the pod. The pod label can be found </w:t>
       </w:r>
-      <w:proofErr w:type="gramStart"/>
-      <w:r>
-        <w:t>using :</w:t>
-      </w:r>
-      <w:proofErr w:type="gramEnd"/>
+      <w:r>
+        <w:t>using:</w:t>
+      </w:r>
       <w:r>
         <w:t xml:space="preserve"> </w:t>
       </w:r>
@@ -843,18 +788,10 @@
       </w:r>
       <w:proofErr w:type="spellEnd"/>
       <w:r>
-        <w:t xml:space="preserve">-resources -o </w:t>
-      </w:r>
-      <w:proofErr w:type="gramStart"/>
-      <w:r>
-        <w:t>wide</w:t>
-      </w:r>
-      <w:r>
-        <w:t xml:space="preserve"> :</w:t>
-      </w:r>
-      <w:proofErr w:type="gramEnd"/>
-      <w:r>
-        <w:t xml:space="preserve"> shows all resources of Kubernetes. Helps to find the </w:t>
+        <w:t>-resources -o wide</w:t>
+      </w:r>
+      <w:r>
+        <w:t xml:space="preserve"> : shows all resources of Kubernetes. Helps to find the </w:t>
       </w:r>
       <w:proofErr w:type="spellStart"/>
       <w:r>
@@ -932,10 +869,158 @@
       <w:proofErr w:type="spellEnd"/>
       <w:r>
         <w:t>-public acts just like the trusted root certificates in your web browser, allowing new clients to safely verify the identity of the Kubernetes API server during a secure TLS connection.</w:t>
+      </w:r>
+    </w:p>
+    <w:p/>
+    <w:p>
+      <w:pPr>
+        <w:rPr>
+          <w:b/>
+          <w:bCs/>
+        </w:rPr>
+      </w:pPr>
+      <w:r>
+        <w:rPr>
+          <w:b/>
+          <w:bCs/>
+        </w:rPr>
+        <w:t>Service Dependency</w:t>
+      </w:r>
+    </w:p>
+    <w:p>
+      <w:proofErr w:type="spellStart"/>
+      <w:r>
+        <w:t>kubectl</w:t>
+      </w:r>
+      <w:proofErr w:type="spellEnd"/>
+      <w:r>
+        <w:t xml:space="preserve"> apply -f folder/ does not guarantee resource creation order.</w:t>
+      </w:r>
+    </w:p>
+    <w:p>
+      <w:r>
+        <w:t>A Pod may start before its required Service exists.</w:t>
+      </w:r>
+    </w:p>
+    <w:p>
+      <w:r>
+        <w:t>The application should retry the connection until the Service is available.</w:t>
+      </w:r>
+    </w:p>
+    <w:p>
+      <w:r>
+        <w:t>Readiness probes prevent traffic from reaching the Pod until the application is ready.</w:t>
+      </w:r>
+    </w:p>
+    <w:p/>
+    <w:p>
+      <w:r>
+        <w:t xml:space="preserve">Remember: Kubernetes doesn't manage dependency order; the application handles </w:t>
+      </w:r>
+      <w:r>
+        <w:t>retry</w:t>
+      </w:r>
+      <w:r>
+        <w:t>.</w:t>
+      </w:r>
+    </w:p>
+    <w:p>
+      <w:r>
+        <w:lastRenderedPageBreak/>
+        <w:t xml:space="preserve">When PID 1 exits, the container runtime records its exit code, and </w:t>
+      </w:r>
+      <w:proofErr w:type="spellStart"/>
+      <w:r>
+        <w:t>kubelet</w:t>
+      </w:r>
+      <w:proofErr w:type="spellEnd"/>
+      <w:r>
+        <w:t xml:space="preserve"> uses that result along with the </w:t>
+      </w:r>
+      <w:proofErr w:type="spellStart"/>
+      <w:r>
+        <w:t>restartPolicy</w:t>
+      </w:r>
+      <w:proofErr w:type="spellEnd"/>
+      <w:r>
+        <w:t xml:space="preserve"> to decide whether to restart the container.</w:t>
+      </w:r>
+    </w:p>
+    <w:p/>
+    <w:p>
+      <w:r>
+        <w:t xml:space="preserve">Kubernetes stores the last applied configuration in the same live object configuration in </w:t>
+      </w:r>
+      <w:proofErr w:type="spellStart"/>
+      <w:r>
+        <w:t>etcd</w:t>
+      </w:r>
+      <w:proofErr w:type="spellEnd"/>
+      <w:r>
+        <w:t xml:space="preserve">. It uses this and the actual </w:t>
+      </w:r>
+      <w:proofErr w:type="spellStart"/>
+      <w:r>
+        <w:t>yaml</w:t>
+      </w:r>
+      <w:proofErr w:type="spellEnd"/>
+      <w:r>
+        <w:t xml:space="preserve"> to decide how modifications need to be performed when using </w:t>
+      </w:r>
+      <w:proofErr w:type="spellStart"/>
+      <w:r>
+        <w:t>kubectl</w:t>
+      </w:r>
+      <w:proofErr w:type="spellEnd"/>
+      <w:r>
+        <w:t xml:space="preserve"> apply command</w:t>
+      </w:r>
+      <w:r>
+        <w:t>s</w:t>
+      </w:r>
+    </w:p>
+    <w:p>
+      <w:r>
+        <w:drawing>
+          <wp:inline distT="0" distB="0" distL="0" distR="0" wp14:anchorId="0B79166A" wp14:editId="6E90FA13">
+            <wp:extent cx="5943600" cy="431165"/>
+            <wp:effectExtent l="0" t="0" r="0" b="6985"/>
+            <wp:docPr id="1445751523" name="Picture 1"/>
+            <wp:cNvGraphicFramePr>
+              <a:graphicFrameLocks xmlns:a="http://schemas.openxmlformats.org/drawingml/2006/main" noChangeAspect="1"/>
+            </wp:cNvGraphicFramePr>
+            <a:graphic xmlns:a="http://schemas.openxmlformats.org/drawingml/2006/main">
+              <a:graphicData uri="http://schemas.openxmlformats.org/drawingml/2006/picture">
+                <pic:pic xmlns:pic="http://schemas.openxmlformats.org/drawingml/2006/picture">
+                  <pic:nvPicPr>
+                    <pic:cNvPr id="1445751523" name=""/>
+                    <pic:cNvPicPr/>
+                  </pic:nvPicPr>
+                  <pic:blipFill>
+                    <a:blip r:embed="rId6"/>
+                    <a:stretch>
+                      <a:fillRect/>
+                    </a:stretch>
+                  </pic:blipFill>
+                  <pic:spPr>
+                    <a:xfrm>
+                      <a:off x="0" y="0"/>
+                      <a:ext cx="5943600" cy="431165"/>
+                    </a:xfrm>
+                    <a:prstGeom prst="rect">
+                      <a:avLst/>
+                    </a:prstGeom>
+                  </pic:spPr>
+                </pic:pic>
+              </a:graphicData>
+            </a:graphic>
+          </wp:inline>
+        </w:drawing>
       </w:r>
     </w:p>
     <w:p/>
     <w:p/>
+    <w:p/>
     <w:p>
       <w:pPr>
         <w:jc w:val="center"/>
@@ -959,6 +1044,36 @@
       </w:r>
       <w:proofErr w:type="spellStart"/>
       <w:r>
+        <w:t>kubectl</w:t>
+      </w:r>
+      <w:proofErr w:type="spellEnd"/>
+      <w:r>
+        <w:t xml:space="preserve"> delete pods –all</w:t>
+      </w:r>
+    </w:p>
+    <w:p>
+      <w:r>
+        <w:t xml:space="preserve">For namespace specific </w:t>
+      </w:r>
+      <w:r>
+        <w:t>resources</w:t>
+      </w:r>
+      <w:r>
+        <w:t xml:space="preserve">: </w:t>
+      </w:r>
+      <w:proofErr w:type="spellStart"/>
+      <w:r>
+        <w:t>kubectl</w:t>
+      </w:r>
+      <w:proofErr w:type="spellEnd"/>
+      <w:r>
+        <w:t xml:space="preserve"> delete pods --all -n &lt;namespace-name&gt;</w:t>
+      </w:r>
+    </w:p>
+    <w:p/>
+    <w:p>
+      <w:proofErr w:type="spellStart"/>
+      <w:r>
         <w:t>k</w:t>
       </w:r>
       <w:r>
@@ -966,84 +1081,142 @@
       </w:r>
       <w:proofErr w:type="spellEnd"/>
       <w:r>
-        <w:t xml:space="preserve"> </w:t>
-      </w:r>
-      <w:r>
-        <w:t>delete</w:t>
-      </w:r>
-      <w:r>
-        <w:t xml:space="preserve"> </w:t>
-      </w:r>
-      <w:r>
-        <w:t>po</w:t>
-      </w:r>
-      <w:r>
-        <w:t>ds –</w:t>
-      </w:r>
-      <w:r>
-        <w:t>all</w:t>
-      </w:r>
-    </w:p>
-    <w:p>
-      <w:r>
-        <w:t xml:space="preserve">For namespace specific </w:t>
-      </w:r>
-      <w:r>
-        <w:t>resources</w:t>
-      </w:r>
-      <w:r>
-        <w:t xml:space="preserve">: </w:t>
-      </w:r>
+        <w:t xml:space="preserve"> get pods --show-</w:t>
+      </w:r>
+      <w:r>
+        <w:t>labels:</w:t>
+      </w:r>
+      <w:r>
+        <w:t xml:space="preserve">  This helps to see the labels attached to a resource. Useful to se</w:t>
+      </w:r>
+      <w:r>
+        <w:t xml:space="preserve">e </w:t>
+      </w:r>
+      <w:r>
+        <w:t>labels.</w:t>
+      </w:r>
+    </w:p>
+    <w:p/>
+    <w:p>
+      <w:proofErr w:type="spellStart"/>
+      <w:r>
+        <w:t>ku</w:t>
+      </w:r>
+      <w:r>
+        <w:t>bectl</w:t>
+      </w:r>
+      <w:proofErr w:type="spellEnd"/>
+      <w:r>
+        <w:t xml:space="preserve"> apply -f </w:t>
+      </w:r>
+      <w:proofErr w:type="spellStart"/>
+      <w:r>
+        <w:t>file.yaml</w:t>
+      </w:r>
+      <w:proofErr w:type="spellEnd"/>
+      <w:r>
+        <w:t xml:space="preserve"> → Creates the resource if it doesn't exist, or updates it if it already exists. </w:t>
+      </w:r>
+    </w:p>
+    <w:p>
       <w:proofErr w:type="spellStart"/>
       <w:r>
         <w:t>kubectl</w:t>
       </w:r>
       <w:proofErr w:type="spellEnd"/>
       <w:r>
-        <w:t xml:space="preserve"> delete pods --all -n &lt;namespace-name&gt;</w:t>
+        <w:t xml:space="preserve"> replace -f </w:t>
+      </w:r>
+      <w:proofErr w:type="spellStart"/>
+      <w:r>
+        <w:t>file.yaml</w:t>
+      </w:r>
+      <w:proofErr w:type="spellEnd"/>
+      <w:r>
+        <w:t xml:space="preserve"> → Replaces an existing resource. It fails if the resource doesn't exist.</w:t>
       </w:r>
     </w:p>
     <w:p/>
     <w:p>
       <w:r>
-        <w:t xml:space="preserve">k </w:t>
-      </w:r>
-      <w:proofErr w:type="gramStart"/>
-      <w:r>
-        <w:t>get</w:t>
-      </w:r>
-      <w:proofErr w:type="gramEnd"/>
-      <w:r>
-        <w:t xml:space="preserve"> pods </w:t>
-      </w:r>
-      <w:r>
-        <w:rPr>
-          <w:b/>
-          <w:bCs/>
-        </w:rPr>
-        <w:t>--show-</w:t>
-      </w:r>
-      <w:proofErr w:type="gramStart"/>
-      <w:r>
-        <w:rPr>
-          <w:b/>
-          <w:bCs/>
-        </w:rPr>
-        <w:t>labels</w:t>
-      </w:r>
-      <w:r>
-        <w:t xml:space="preserve"> :</w:t>
-      </w:r>
-      <w:proofErr w:type="gramEnd"/>
-      <w:r>
-        <w:t xml:space="preserve">  This helps to see the labels attached to a resource. Useful to se</w:t>
-      </w:r>
-      <w:r>
-        <w:t xml:space="preserve">e </w:t>
-      </w:r>
-      <w:proofErr w:type="spellStart"/>
-      <w:r>
-        <w:t>labels.</w:t>
+        <w:t xml:space="preserve">You can use the </w:t>
+      </w:r>
+      <w:proofErr w:type="spellStart"/>
+      <w:r>
+        <w:t>kubectl</w:t>
+      </w:r>
+      <w:proofErr w:type="spellEnd"/>
+      <w:r>
+        <w:t xml:space="preserve"> explain to learn more about different resources.</w:t>
+      </w:r>
+    </w:p>
+    <w:p>
+      <w:r>
+        <w:t xml:space="preserve">Eg: </w:t>
+      </w:r>
+      <w:proofErr w:type="spellStart"/>
+      <w:r>
+        <w:t>kubectl</w:t>
+      </w:r>
+      <w:proofErr w:type="spellEnd"/>
+      <w:r>
+        <w:t xml:space="preserve"> explain pod, </w:t>
+      </w:r>
+      <w:proofErr w:type="spellStart"/>
+      <w:r>
+        <w:t>kubectl</w:t>
+      </w:r>
+      <w:proofErr w:type="spellEnd"/>
+      <w:r>
+        <w:t xml:space="preserve"> explain </w:t>
+      </w:r>
+      <w:proofErr w:type="spellStart"/>
+      <w:r>
+        <w:t>pod.spec</w:t>
+      </w:r>
+      <w:proofErr w:type="spellEnd"/>
+      <w:r>
+        <w:t>.</w:t>
+      </w:r>
+    </w:p>
+    <w:p>
+      <w:r>
+        <w:t xml:space="preserve">You can use  --recursive flag to display all the applicable fields that are part of </w:t>
+      </w:r>
+      <w:r>
+        <w:t>those resources</w:t>
+      </w:r>
+      <w:r>
+        <w:t xml:space="preserve">:  </w:t>
+      </w:r>
+    </w:p>
+    <w:p>
+      <w:r>
+        <w:lastRenderedPageBreak/>
+        <w:t xml:space="preserve">Eg: </w:t>
+      </w:r>
+      <w:proofErr w:type="spellStart"/>
+      <w:r>
+        <w:t>kubectl</w:t>
+      </w:r>
+      <w:proofErr w:type="spellEnd"/>
+      <w:r>
+        <w:t xml:space="preserve"> explain </w:t>
+      </w:r>
+      <w:proofErr w:type="spellStart"/>
+      <w:r>
+        <w:t>pod.spec</w:t>
+      </w:r>
+      <w:proofErr w:type="spellEnd"/>
+      <w:r>
+        <w:t xml:space="preserve"> --</w:t>
+      </w:r>
+      <w:proofErr w:type="spellStart"/>
+      <w:r>
+        <w:t>recusrsive</w:t>
+      </w:r>
+      <w:r>
+        <w:t>s</w:t>
       </w:r>
       <w:proofErr w:type="spellEnd"/>
     </w:p>

</xml_diff>